<commit_message>
Roxi assistant, PFAU.NRW grayout, smarter import, Windows build workflow
- Rename AI assistant to Roxi with 3-step confirmation flow before doc creation
- Gray out PFAU.NRW section in sidebar with "In Entwicklung" label
- Skip gender dialog for already-known employees on re-import
- Auto-resolve ambiguous names for existing employees, only ask for new ones
- Update document templates (kuendigung, abmahnung, zeugnisse, azubi, av)
- Remove old individual document files from public folder

Co-Authored-By: Claude Sonnet 4.6 <noreply@anthropic.com>
</commit_message>
<xml_diff>
--- a/public/azubi/azubi_male.docx
+++ b/public/azubi/azubi_male.docx
@@ -814,7 +814,23 @@
           <w:sz w:val="22"/>
           <w:szCs w:val="22"/>
         </w:rPr>
-        <w:t>zur Pflegefach</w:t>
+        <w:t>zu</w:t>
+      </w:r>
+      <w:r>
+        <w:rPr>
+          <w:rFonts w:ascii="Arial" w:hAnsi="Arial" w:cs="Arial"/>
+          <w:sz w:val="22"/>
+          <w:szCs w:val="22"/>
+        </w:rPr>
+        <w:t>m</w:t>
+      </w:r>
+      <w:r>
+        <w:rPr>
+          <w:rFonts w:ascii="Arial" w:hAnsi="Arial" w:cs="Arial"/>
+          <w:sz w:val="22"/>
+          <w:szCs w:val="22"/>
+        </w:rPr>
+        <w:t xml:space="preserve"> Pflegefach</w:t>
       </w:r>
       <w:r>
         <w:rPr>

</xml_diff>